<commit_message>
fix: procuração condensada em uma lauda, sem redundâncias
Texto mais objetivo: eliminou parágrafo CPC redundante, fundiu poderes
gerais e especiais em bloco único, reduziu qualificações ao essencial.
Mantém headers/footers originais do template HBON.

Co-Authored-By: Claude Opus 4.6 <noreply@anthropic.com>
Claude-Session: https://claude.ai/code/session_01Y8V1mCLLyw77QZ84vJLjdq
</commit_message>
<xml_diff>
--- a/peticoes/procuracao-alves-bonaldi-serra.docx
+++ b/peticoes/procuracao-alves-bonaldi-serra.docx
@@ -4,17 +4,16 @@
   <w:body>
     <w:p>
       <w:pPr>
-        <w:spacing w:after="120" w:line="280" w:lineRule="auto"/>
+        <w:spacing w:after="100" w:before="0" w:line="264" w:lineRule="auto"/>
         <w:jc w:val="center"/>
         <w:rPr>
-          <w:b/>
           <w:lang w:val="pt-BR"/>
         </w:rPr>
       </w:pPr>
       <w:r>
         <w:rPr>
           <w:b/>
-          <w:sz w:val="28"/>
+          <w:sz w:val="26"/>
           <w:lang w:val="pt-BR"/>
         </w:rPr>
         <w:t xml:space="preserve">PROCURAÇÃO </w:t>
@@ -23,7 +22,7 @@
         <w:rPr>
           <w:b/>
           <w:i/>
-          <w:sz w:val="28"/>
+          <w:sz w:val="26"/>
           <w:lang w:val="pt-BR"/>
         </w:rPr>
         <w:t>AD JUDICIA ET EXTRA</w:t>
@@ -31,7 +30,8 @@
     </w:p>
     <w:p>
       <w:pPr>
-        <w:spacing w:after="120" w:line="280" w:lineRule="auto"/>
+        <w:spacing w:after="80" w:before="0" w:line="264" w:lineRule="auto"/>
+        <w:jc w:val="both"/>
         <w:ind w:firstLine="709"/>
         <w:rPr>
           <w:lang w:val="pt-BR"/>
@@ -48,12 +48,13 @@
         <w:rPr>
           <w:lang w:val="pt-BR"/>
         </w:rPr>
-        <w:t>, pessoa jurídica de direito privado, inscrita no CNPJ/MF sob o nº 42.846.895/0001-20, com sede na Avenida João Palácio, nº 300, Loja LUC 107C, Piso 0, Bairro Eurico Salles, Serra/ES, CEP 29.160-161, Cadastro Municipal nº 04729439, neste ato representada por seu(sua) sócio(a)-administrador(a).</w:t>
+        <w:t>, pessoa jurídica de direito privado, CNPJ 42.846.895/0001-20, Av. João Palácio, 300, Loja LUC 107C, Eurico Salles, Serra/ES, CEP 29.160-161, CCM 04729439, representada por seu(sua) sócio(a)-administrador(a).</w:t>
       </w:r>
     </w:p>
     <w:p>
       <w:pPr>
-        <w:spacing w:after="120" w:line="280" w:lineRule="auto"/>
+        <w:spacing w:after="80" w:before="0" w:line="264" w:lineRule="auto"/>
+        <w:jc w:val="both"/>
         <w:ind w:firstLine="709"/>
         <w:rPr>
           <w:lang w:val="pt-BR"/>
@@ -70,12 +71,13 @@
         <w:rPr>
           <w:lang w:val="pt-BR"/>
         </w:rPr>
-        <w:t>, advogado, inscrito na OAB/ES sob o nº 15.513, com escritório profissional na Rua Professor Telmo de Souza Torres, nº 70, sala 1206, Vila Velha/ES, CEP 29.101-350.</w:t>
+        <w:t>, advogado, OAB/ES 15.513, com escritório na Rua Prof. Telmo de Souza Torres, 70, sl. 1206, Vila Velha/ES, CEP 29.101-350.</w:t>
       </w:r>
     </w:p>
     <w:p>
       <w:pPr>
-        <w:spacing w:after="120" w:line="280" w:lineRule="auto"/>
+        <w:spacing w:after="80" w:before="0" w:line="264" w:lineRule="auto"/>
+        <w:jc w:val="both"/>
         <w:ind w:firstLine="709"/>
         <w:rPr>
           <w:lang w:val="pt-BR"/>
@@ -92,7 +94,7 @@
         <w:rPr>
           <w:lang w:val="pt-BR"/>
         </w:rPr>
-        <w:t xml:space="preserve">Pelo presente instrumento particular de mandato, a OUTORGANTE nomeia e constitui seu bastante procurador o OUTORGADO acima qualificado, a quem confere os poderes da cláusula </w:t>
+        <w:t xml:space="preserve">Pelo presente instrumento, a OUTORGANTE constitui o OUTORGADO seu bastante procurador, conferindo-lhe os amplos e gerais poderes da cláusula </w:t>
       </w:r>
       <w:r>
         <w:rPr>
@@ -105,36 +107,20 @@
         <w:rPr>
           <w:lang w:val="pt-BR"/>
         </w:rPr>
-        <w:t xml:space="preserve">, para o foro em geral, em qualquer Juízo, Instância ou Tribunal, bem como na esfera administrativa, podendo propor e acompanhar as ações e defesas necessárias, requerer, alegar e praticar todos os atos indispensáveis à defesa dos direitos e interesses da OUTORGANTE, especialmente </w:t>
+        <w:t xml:space="preserve"> (art. 105 do CPC), para o foro em geral, em qualquer Juízo, Instância ou Tribunal, e na esfera administrativa, especialmente </w:t>
       </w:r>
       <w:r>
         <w:rPr>
           <w:b/>
           <w:lang w:val="pt-BR"/>
         </w:rPr>
-        <w:t>perante a Prefeitura Municipal de Serra/ES e todos os seus órgãos e secretarias, incluindo a Secretaria Municipal de Finanças (SEMFA), a Procuradoria-Geral do Município (PGM), a Secretaria de Saúde (Vigilância Sanitária) e quaisquer repartições da Administração Pública municipal</w:t>
+        <w:t>perante a Prefeitura Municipal de Serra/ES e todos os seus órgãos, incluindo a Secretaria Municipal de Finanças (SEMFA), a Procuradoria-Geral do Município (PGM) e a Vigilância Sanitária</w:t>
       </w:r>
       <w:r>
         <w:rPr>
           <w:lang w:val="pt-BR"/>
         </w:rPr>
-        <w:t>.</w:t>
-      </w:r>
-    </w:p>
-    <w:p>
-      <w:pPr>
-        <w:spacing w:after="120" w:line="280" w:lineRule="auto"/>
-        <w:ind w:firstLine="709"/>
-        <w:rPr>
-          <w:lang w:val="pt-BR"/>
-        </w:rPr>
-      </w:pPr>
-      <w:r>
-        <w:rPr>
-          <w:rFonts w:cs="Times New Roman"/>
-          <w:lang w:val="pt-BR"/>
-        </w:rPr>
-        <w:t xml:space="preserve">Para tanto, ficam outorgados poderes amplos e gerais, além dos poderes especiais adiante discriminados: </w:t>
+        <w:t xml:space="preserve">, com os seguintes poderes especiais: </w:t>
       </w:r>
       <w:r>
         <w:rPr>
@@ -142,14 +128,14 @@
           <w:i/>
           <w:lang w:val="pt-BR"/>
         </w:rPr>
-        <w:t>a)</w:t>
+        <w:t xml:space="preserve">a) </w:t>
       </w:r>
       <w:r>
         <w:rPr>
           <w:rFonts w:cs="Times New Roman"/>
           <w:lang w:val="pt-BR"/>
         </w:rPr>
-        <w:t xml:space="preserve"> representar a OUTORGANTE perante a Prefeitura de Serra/ES, a SEMFA, a PGM, bem como perante quaisquer órgãos e repartições da Administração Pública municipal, protocolando, acompanhando e retirando processos e requerimentos administrativos, apresentando defesas, impugnações, recursos e manifestações; </w:t>
+        <w:t xml:space="preserve">representar a OUTORGANTE perante quaisquer órgãos da Administração Pública municipal, estadual e federal, protocolando, retirando e acompanhando processos, apresentando defesas, impugnações e recursos; </w:t>
       </w:r>
       <w:r>
         <w:rPr>
@@ -157,14 +143,14 @@
           <w:i/>
           <w:lang w:val="pt-BR"/>
         </w:rPr>
-        <w:t>b)</w:t>
+        <w:t xml:space="preserve">b) </w:t>
       </w:r>
       <w:r>
         <w:rPr>
           <w:rFonts w:cs="Times New Roman"/>
           <w:lang w:val="pt-BR"/>
         </w:rPr>
-        <w:t xml:space="preserve"> requerer e obter certidões, extratos, cópias de processos administrativos, demonstrativos de débitos e informações fiscais e cadastrais; </w:t>
+        <w:t xml:space="preserve">requerer certidões, extratos, demonstrativos de débitos e informações fiscais e cadastrais; </w:t>
       </w:r>
       <w:r>
         <w:rPr>
@@ -172,14 +158,14 @@
           <w:i/>
           <w:lang w:val="pt-BR"/>
         </w:rPr>
-        <w:t>c)</w:t>
+        <w:t xml:space="preserve">c) </w:t>
       </w:r>
       <w:r>
         <w:rPr>
           <w:rFonts w:cs="Times New Roman"/>
           <w:lang w:val="pt-BR"/>
         </w:rPr>
-        <w:t xml:space="preserve"> discutir, negociar e formalizar parcelamentos, transações e acordos tributários, bem como requerer revisão, compensação, restituição e cancelamento de débitos e lançamentos; </w:t>
+        <w:t xml:space="preserve">negociar e formalizar parcelamentos, transações e acordos tributários, requerer revisão, compensação, restituição e cancelamento de débitos; </w:t>
       </w:r>
       <w:r>
         <w:rPr>
@@ -187,14 +173,14 @@
           <w:i/>
           <w:lang w:val="pt-BR"/>
         </w:rPr>
-        <w:t>d)</w:t>
+        <w:t xml:space="preserve">d) </w:t>
       </w:r>
       <w:r>
         <w:rPr>
           <w:rFonts w:cs="Times New Roman"/>
           <w:lang w:val="pt-BR"/>
         </w:rPr>
-        <w:t xml:space="preserve"> desistir, transigir, firmar compromissos, receber e dar quitação, prestar e assinar declarações e termos, inclusive de confissão de dívida; e </w:t>
+        <w:t xml:space="preserve">transigir, firmar compromissos, receber e dar quitação, assinar declarações e termos; </w:t>
       </w:r>
       <w:r>
         <w:rPr>
@@ -202,14 +188,14 @@
           <w:i/>
           <w:lang w:val="pt-BR"/>
         </w:rPr>
-        <w:t>e)</w:t>
+        <w:t xml:space="preserve">e) </w:t>
       </w:r>
       <w:r>
         <w:rPr>
           <w:rFonts w:cs="Times New Roman"/>
           <w:lang w:val="pt-BR"/>
         </w:rPr>
-        <w:t xml:space="preserve"> acessar sistemas eletrônicos municipais em nome da OUTORGANTE, incluindo portais de consulta de débitos, emissão de guias e acompanhamento de processos; e </w:t>
+        <w:t xml:space="preserve">acessar sistemas eletrônicos em nome da OUTORGANTE; e </w:t>
       </w:r>
       <w:r>
         <w:rPr>
@@ -217,47 +203,20 @@
           <w:i/>
           <w:lang w:val="pt-BR"/>
         </w:rPr>
-        <w:t>f)</w:t>
+        <w:t xml:space="preserve">f) </w:t>
       </w:r>
       <w:r>
         <w:rPr>
           <w:rFonts w:cs="Times New Roman"/>
           <w:lang w:val="pt-BR"/>
         </w:rPr>
-        <w:t xml:space="preserve"> substabelecer esta procuração, com ou sem reserva de iguais poderes, a quem convier, dando tudo por bom, firme e valioso.</w:t>
+        <w:t>substabelecer, com ou sem reserva de poderes, dando tudo por bom, firme e valioso.</w:t>
       </w:r>
     </w:p>
     <w:p>
       <w:pPr>
-        <w:spacing w:after="120" w:line="280" w:lineRule="auto"/>
-        <w:ind w:firstLine="709"/>
-        <w:rPr>
-          <w:lang w:val="pt-BR"/>
-        </w:rPr>
-      </w:pPr>
-      <w:r>
-        <w:rPr>
-          <w:lang w:val="pt-BR"/>
-        </w:rPr>
-        <w:t xml:space="preserve">Os poderes das cláusulas </w:t>
-      </w:r>
-      <w:r>
-        <w:rPr>
-          <w:i/>
-          <w:lang w:val="pt-BR"/>
-        </w:rPr>
-        <w:t>ad judicia et extra</w:t>
-      </w:r>
-      <w:r>
-        <w:rPr>
-          <w:lang w:val="pt-BR"/>
-        </w:rPr>
-        <w:t xml:space="preserve"> compreendem, ainda, os previstos no art. 105 do Código de Processo Civil, reputando-se válidos e eficazes todos os atos praticados pelo OUTORGADO no regular exercício do presente mandato.</w:t>
-      </w:r>
-    </w:p>
-    <w:p>
-      <w:pPr>
-        <w:spacing w:before="120" w:after="120" w:line="280" w:lineRule="auto"/>
+        <w:spacing w:after="60" w:before="160" w:line="264" w:lineRule="auto"/>
+        <w:jc w:val="both"/>
         <w:ind w:firstLine="709"/>
         <w:rPr>
           <w:lang w:val="pt-BR"/>
@@ -272,8 +231,8 @@
     </w:p>
     <w:p>
       <w:pPr>
-        <w:spacing w:before="120" w:after="120" w:line="280" w:lineRule="auto"/>
-        <w:ind w:firstLine="709"/>
+        <w:spacing w:after="0" w:before="280" w:line="264" w:lineRule="auto"/>
+        <w:jc w:val="both"/>
         <w:rPr>
           <w:lang w:val="pt-BR"/>
         </w:rPr>
@@ -281,35 +240,22 @@
     </w:p>
     <w:p>
       <w:pPr>
-        <w:spacing w:before="120" w:after="120" w:line="280" w:lineRule="auto"/>
-        <w:ind w:firstLine="709"/>
+        <w:spacing w:after="20" w:before="0" w:line="264" w:lineRule="auto"/>
+        <w:jc w:val="center"/>
         <w:rPr>
           <w:lang w:val="pt-BR"/>
         </w:rPr>
       </w:pPr>
+      <w:r>
+        <w:rPr>
+          <w:lang w:val="pt-BR"/>
+        </w:rPr>
+        <w:t>________________________________________</w:t>
+      </w:r>
     </w:p>
     <w:p>
       <w:pPr>
-        <w:spacing w:before="120" w:after="120" w:line="280" w:lineRule="auto"/>
-        <w:ind w:firstLine="709"/>
-        <w:rPr>
-          <w:lang w:val="pt-BR"/>
-        </w:rPr>
-      </w:pPr>
-    </w:p>
-    <w:p>
-      <w:pPr>
-        <w:spacing w:line="280" w:lineRule="auto"/>
-        <w:jc w:val="center"/>
-        <w:rPr>
-          <w:b/>
-          <w:lang w:val="pt-BR"/>
-        </w:rPr>
-      </w:pPr>
-    </w:p>
-    <w:p>
-      <w:pPr>
-        <w:spacing w:line="280" w:lineRule="auto"/>
+        <w:spacing w:after="20" w:before="0" w:line="264" w:lineRule="auto"/>
         <w:jc w:val="center"/>
         <w:rPr>
           <w:lang w:val="pt-BR"/>
@@ -325,22 +271,7 @@
     </w:p>
     <w:p>
       <w:pPr>
-        <w:spacing w:line="280" w:lineRule="auto"/>
-        <w:jc w:val="center"/>
-        <w:rPr>
-          <w:lang w:val="pt-BR"/>
-        </w:rPr>
-      </w:pPr>
-      <w:r>
-        <w:rPr>
-          <w:lang w:val="pt-BR"/>
-        </w:rPr>
-        <w:t>Outorgante — CNPJ nº 42.846.895/0001-20</w:t>
-      </w:r>
-    </w:p>
-    <w:p>
-      <w:pPr>
-        <w:spacing w:line="280" w:lineRule="auto"/>
+        <w:spacing w:after="40" w:before="0" w:line="264" w:lineRule="auto"/>
         <w:jc w:val="center"/>
         <w:rPr>
           <w:lang w:val="pt-BR"/>
@@ -351,12 +282,12 @@
           <w:sz w:val="20"/>
           <w:lang w:val="pt-BR"/>
         </w:rPr>
-        <w:t>Representante legal: ______________________________________</w:t>
+        <w:t>CNPJ 42.846.895/0001-20</w:t>
       </w:r>
     </w:p>
     <w:p>
       <w:pPr>
-        <w:spacing w:line="280" w:lineRule="auto"/>
+        <w:spacing w:after="0" w:before="0" w:line="264" w:lineRule="auto"/>
         <w:jc w:val="center"/>
         <w:rPr>
           <w:lang w:val="pt-BR"/>
@@ -367,7 +298,7 @@
           <w:sz w:val="20"/>
           <w:lang w:val="pt-BR"/>
         </w:rPr>
-        <w:t>CPF nº ___.___.___-__ — RG nº _______________</w:t>
+        <w:t>Representante: __________________________ CPF: ___.___.___ -__</w:t>
       </w:r>
     </w:p>
     <w:sectPr>
@@ -426,20 +357,7 @@
   <w:p>
     <w:pPr>
       <w:pStyle w:val="Rodap"/>
-      <w:pBdr>
-        <w:top w:val="single" w:sz="4" w:space="4" w:color="1a3c6e"/>
-      </w:pBdr>
-      <w:jc w:val="center"/>
-    </w:pPr>
-    <w:r>
-      <w:rPr>
-        <w:color w:val="777777"/>
-        <w:sz w:val="14"/>
-        <w:szCs w:val="14"/>
-        <w:lang w:val="pt-BR"/>
-      </w:rPr>
-      <w:t>Rua Prof. Telmo de Souza Torres, 70, sl. 1206, Vila Velha/ES — E-mail: ltcarmo@gmail.com</w:t>
-    </w:r>
+    </w:pPr>
   </w:p>
 </w:ftr>
 </file>
@@ -494,60 +412,6 @@
   <w:p>
     <w:pPr>
       <w:pStyle w:val="Cabealho"/>
-      <w:jc w:val="center"/>
-      <w:spacing w:after="0"/>
-    </w:pPr>
-    <w:r>
-      <w:rPr>
-        <w:b/>
-        <w:smallCaps/>
-        <w:color w:val="1a3c6e"/>
-        <w:sz w:val="30"/>
-        <w:szCs w:val="30"/>
-        <w:lang w:val="pt-BR"/>
-      </w:rPr>
-      <w:t>TRISTÃO ADVOCACIA</w:t>
-    </w:r>
-  </w:p>
-  <w:p>
-    <w:pPr>
-      <w:pStyle w:val="Cabealho"/>
-      <w:jc w:val="center"/>
-      <w:spacing w:after="0"/>
-    </w:pPr>
-    <w:r>
-      <w:rPr>
-        <w:color w:val="555555"/>
-        <w:sz w:val="16"/>
-        <w:szCs w:val="16"/>
-        <w:lang w:val="pt-BR"/>
-      </w:rPr>
-      <w:t>Lucas Tristão do Carmo — OAB/ES 15.513</w:t>
-    </w:r>
-  </w:p>
-  <w:p>
-    <w:pPr>
-      <w:pStyle w:val="Cabealho"/>
-      <w:jc w:val="center"/>
-      <w:spacing w:after="40"/>
-    </w:pPr>
-    <w:r>
-      <w:rPr>
-        <w:color w:val="555555"/>
-        <w:sz w:val="16"/>
-        <w:szCs w:val="16"/>
-        <w:lang w:val="pt-BR"/>
-      </w:rPr>
-      <w:t>Rua Professor Telmo de Souza Torres, 70, sala 1206 — Vila Velha/ES — CEP 29.101-350</w:t>
-    </w:r>
-  </w:p>
-  <w:p>
-    <w:pPr>
-      <w:pStyle w:val="Cabealho"/>
-      <w:pBdr>
-        <w:bottom w:val="single" w:sz="6" w:space="1" w:color="1a3c6e"/>
-      </w:pBdr>
-      <w:spacing w:after="0"/>
     </w:pPr>
   </w:p>
 </w:hdr>

</xml_diff>

<commit_message>
fix: procuração com timbrado padrão Tristão Advocacia + data atual
Aplica identidade visual oficial (logo + TRISTÃO ADVOCACIA vermelho/cinza
no header, endereço/OAB/paginação no footer). Data 14/09/2026.
Texto condensado em uma lauda.

Co-Authored-By: Claude Opus 4.6 <noreply@anthropic.com>
Claude-Session: https://claude.ai/code/session_01Y8V1mCLLyw77QZ84vJLjdq
</commit_message>
<xml_diff>
--- a/peticoes/procuracao-alves-bonaldi-serra.docx
+++ b/peticoes/procuracao-alves-bonaldi-serra.docx
@@ -226,7 +226,7 @@
         <w:rPr>
           <w:lang w:val="pt-BR"/>
         </w:rPr>
-        <w:t>Serra/ES, _____ de __________________ de 2026.</w:t>
+        <w:t>Serra/ES, 14 de setembro de 2026.</w:t>
       </w:r>
     </w:p>
     <w:p>
@@ -353,11 +353,79 @@
 </file>
 
 <file path=word/footer2.xml><?xml version="1.0" encoding="utf-8"?>
-<w:ftr xmlns:wpc="http://schemas.microsoft.com/office/word/2010/wordprocessingCanvas" xmlns:cx="http://schemas.microsoft.com/office/drawing/2014/chartex" xmlns:cx1="http://schemas.microsoft.com/office/drawing/2015/9/8/chartex" xmlns:cx2="http://schemas.microsoft.com/office/drawing/2015/10/21/chartex" xmlns:cx3="http://schemas.microsoft.com/office/drawing/2016/5/9/chartex" xmlns:cx4="http://schemas.microsoft.com/office/drawing/2016/5/10/chartex" xmlns:cx5="http://schemas.microsoft.com/office/drawing/2016/5/11/chartex" xmlns:cx6="http://schemas.microsoft.com/office/drawing/2016/5/12/chartex" xmlns:cx7="http://schemas.microsoft.com/office/drawing/2016/5/13/chartex" xmlns:cx8="http://schemas.microsoft.com/office/drawing/2016/5/14/chartex" xmlns:mc="http://schemas.openxmlformats.org/markup-compatibility/2006" xmlns:aink="http://schemas.microsoft.com/office/drawing/2016/ink" xmlns:am3d="http://schemas.microsoft.com/office/drawing/2017/model3d" xmlns:o="urn:schemas-microsoft-com:office:office" xmlns:oel="http://schemas.microsoft.com/office/2019/extlst" xmlns:r="http://schemas.openxmlformats.org/officeDocument/2006/relationships" xmlns:m="http://schemas.openxmlformats.org/officeDocument/2006/math" xmlns:v="urn:schemas-microsoft-com:vml" xmlns:wp14="http://schemas.microsoft.com/office/word/2010/wordprocessingDrawing" xmlns:wp="http://schemas.openxmlformats.org/drawingml/2006/wordprocessingDrawing" xmlns:w10="urn:schemas-microsoft-com:office:word" xmlns:w="http://schemas.openxmlformats.org/wordprocessingml/2006/main" xmlns:w14="http://schemas.microsoft.com/office/word/2010/wordml" xmlns:w15="http://schemas.microsoft.com/office/word/2012/wordml" xmlns:w16cex="http://schemas.microsoft.com/office/word/2018/wordml/cex" xmlns:w16cid="http://schemas.microsoft.com/office/word/2016/wordml/cid" xmlns:w16="http://schemas.microsoft.com/office/word/2018/wordml" xmlns:w16du="http://schemas.microsoft.com/office/word/2023/wordml/word16du" xmlns:w16sdtdh="http://schemas.microsoft.com/office/word/2020/wordml/sdtdatahash" xmlns:w16se="http://schemas.microsoft.com/office/word/2015/wordml/symex" xmlns:wpg="http://schemas.microsoft.com/office/word/2010/wordprocessingGroup" xmlns:wpi="http://schemas.microsoft.com/office/word/2010/wordprocessingInk" xmlns:wne="http://schemas.microsoft.com/office/word/2006/wordml" xmlns:wps="http://schemas.microsoft.com/office/word/2010/wordprocessingShape" mc:Ignorable="w14 w15 w16se w16cid w16 w16cex w16sdtdh w16du wp14">
+<w:ftr xmlns:m="http://schemas.openxmlformats.org/officeDocument/2006/math" xmlns:mc="http://schemas.openxmlformats.org/markup-compatibility/2006" xmlns:mo="http://schemas.microsoft.com/office/mac/office/2008/main" xmlns:mv="urn:schemas-microsoft-com:mac:vml" xmlns:o="urn:schemas-microsoft-com:office:office" xmlns:r="http://schemas.openxmlformats.org/officeDocument/2006/relationships" xmlns:v="urn:schemas-microsoft-com:vml" xmlns:w10="urn:schemas-microsoft-com:office:word" xmlns:w14="http://schemas.microsoft.com/office/word/2010/wordml" xmlns:w="http://schemas.openxmlformats.org/wordprocessingml/2006/main" xmlns:wne="http://schemas.microsoft.com/office/word/2006/wordml" xmlns:wp14="http://schemas.microsoft.com/office/word/2010/wordprocessingDrawing" xmlns:wp="http://schemas.openxmlformats.org/drawingml/2006/wordprocessingDrawing" xmlns:wpc="http://schemas.microsoft.com/office/word/2010/wordprocessingCanvas" xmlns:wpg="http://schemas.microsoft.com/office/word/2010/wordprocessingGroup" xmlns:wpi="http://schemas.microsoft.com/office/word/2010/wordprocessingInk" xmlns:wps="http://schemas.microsoft.com/office/word/2010/wordprocessingShape" mc:Ignorable="w14 wp14">
   <w:p>
     <w:pPr>
-      <w:pStyle w:val="Rodap"/>
-    </w:pPr>
+      <w:pStyle w:val="Footer"/>
+      <w:jc w:val="center"/>
+      <w:pBdr>
+        <w:top w:val="single" w:sz="6" w:space="8" w:color="BFC0BF"/>
+      </w:pBdr>
+    </w:pPr>
+    <w:r>
+      <w:rPr>
+        <w:rFonts w:ascii="Calibri" w:hAnsi="Calibri"/>
+        <w:b w:val="0"/>
+        <w:color w:val="8A8B8A"/>
+        <w:sz w:val="16"/>
+      </w:rPr>
+      <w:t>Rua Professor Telmo de Souza Torres, 70 · Sala 1206 · Vila Velha/ES · CEP 29.101-350</w:t>
+    </w:r>
+  </w:p>
+  <w:p>
+    <w:pPr>
+      <w:jc w:val="center"/>
+    </w:pPr>
+    <w:r>
+      <w:rPr>
+        <w:rFonts w:ascii="Calibri" w:hAnsi="Calibri"/>
+        <w:b w:val="0"/>
+        <w:color w:val="8A8B8A"/>
+        <w:sz w:val="16"/>
+      </w:rPr>
+      <w:t>OAB/ES 15.513 · Lucas.tristao@icloud.com</w:t>
+    </w:r>
+  </w:p>
+  <w:p>
+    <w:pPr>
+      <w:jc w:val="right"/>
+    </w:pPr>
+    <w:r>
+      <w:rPr>
+        <w:rFonts w:ascii="Calibri" w:hAnsi="Calibri"/>
+        <w:color w:val="8A8B8A"/>
+        <w:sz w:val="16"/>
+      </w:rPr>
+      <w:t xml:space="preserve">Página </w:t>
+    </w:r>
+    <w:fldSimple w:instr="PAGE">
+      <w:r>
+        <w:rPr>
+          <w:rFonts w:ascii="Calibri" w:hAnsi="Calibri"/>
+          <w:color w:val="8A8B8A"/>
+          <w:sz w:val="16"/>
+        </w:rPr>
+        <w:t>1</w:t>
+      </w:r>
+    </w:fldSimple>
+    <w:r>
+      <w:rPr>
+        <w:rFonts w:ascii="Calibri" w:hAnsi="Calibri"/>
+        <w:color w:val="8A8B8A"/>
+        <w:sz w:val="16"/>
+      </w:rPr>
+      <w:t xml:space="preserve"> de </w:t>
+    </w:r>
+    <w:fldSimple w:instr="NUMPAGES">
+      <w:r>
+        <w:rPr>
+          <w:rFonts w:ascii="Calibri" w:hAnsi="Calibri"/>
+          <w:color w:val="8A8B8A"/>
+          <w:sz w:val="16"/>
+        </w:rPr>
+        <w:t>1</w:t>
+      </w:r>
+    </w:fldSimple>
   </w:p>
 </w:ftr>
 </file>
@@ -408,11 +476,74 @@
 </file>
 
 <file path=word/header2.xml><?xml version="1.0" encoding="utf-8"?>
-<w:hdr xmlns:wpc="http://schemas.microsoft.com/office/word/2010/wordprocessingCanvas" xmlns:cx="http://schemas.microsoft.com/office/drawing/2014/chartex" xmlns:cx1="http://schemas.microsoft.com/office/drawing/2015/9/8/chartex" xmlns:cx2="http://schemas.microsoft.com/office/drawing/2015/10/21/chartex" xmlns:cx3="http://schemas.microsoft.com/office/drawing/2016/5/9/chartex" xmlns:cx4="http://schemas.microsoft.com/office/drawing/2016/5/10/chartex" xmlns:cx5="http://schemas.microsoft.com/office/drawing/2016/5/11/chartex" xmlns:cx6="http://schemas.microsoft.com/office/drawing/2016/5/12/chartex" xmlns:cx7="http://schemas.microsoft.com/office/drawing/2016/5/13/chartex" xmlns:cx8="http://schemas.microsoft.com/office/drawing/2016/5/14/chartex" xmlns:mc="http://schemas.openxmlformats.org/markup-compatibility/2006" xmlns:aink="http://schemas.microsoft.com/office/drawing/2016/ink" xmlns:am3d="http://schemas.microsoft.com/office/drawing/2017/model3d" xmlns:o="urn:schemas-microsoft-com:office:office" xmlns:oel="http://schemas.microsoft.com/office/2019/extlst" xmlns:r="http://schemas.openxmlformats.org/officeDocument/2006/relationships" xmlns:m="http://schemas.openxmlformats.org/officeDocument/2006/math" xmlns:v="urn:schemas-microsoft-com:vml" xmlns:wp14="http://schemas.microsoft.com/office/word/2010/wordprocessingDrawing" xmlns:wp="http://schemas.openxmlformats.org/drawingml/2006/wordprocessingDrawing" xmlns:w10="urn:schemas-microsoft-com:office:word" xmlns:w="http://schemas.openxmlformats.org/wordprocessingml/2006/main" xmlns:w14="http://schemas.microsoft.com/office/word/2010/wordml" xmlns:w15="http://schemas.microsoft.com/office/word/2012/wordml" xmlns:w16cex="http://schemas.microsoft.com/office/word/2018/wordml/cex" xmlns:w16cid="http://schemas.microsoft.com/office/word/2016/wordml/cid" xmlns:w16="http://schemas.microsoft.com/office/word/2018/wordml" xmlns:w16du="http://schemas.microsoft.com/office/word/2023/wordml/word16du" xmlns:w16sdtdh="http://schemas.microsoft.com/office/word/2020/wordml/sdtdatahash" xmlns:w16se="http://schemas.microsoft.com/office/word/2015/wordml/symex" xmlns:wpg="http://schemas.microsoft.com/office/word/2010/wordprocessingGroup" xmlns:wpi="http://schemas.microsoft.com/office/word/2010/wordprocessingInk" xmlns:wne="http://schemas.microsoft.com/office/word/2006/wordml" xmlns:wps="http://schemas.microsoft.com/office/word/2010/wordprocessingShape" mc:Ignorable="w14 w15 w16se w16cid w16 w16cex w16sdtdh w16du wp14">
+<w:hdr xmlns:m="http://schemas.openxmlformats.org/officeDocument/2006/math" xmlns:mc="http://schemas.openxmlformats.org/markup-compatibility/2006" xmlns:mo="http://schemas.microsoft.com/office/mac/office/2008/main" xmlns:mv="urn:schemas-microsoft-com:mac:vml" xmlns:o="urn:schemas-microsoft-com:office:office" xmlns:r="http://schemas.openxmlformats.org/officeDocument/2006/relationships" xmlns:v="urn:schemas-microsoft-com:vml" xmlns:w10="urn:schemas-microsoft-com:office:word" xmlns:w14="http://schemas.microsoft.com/office/word/2010/wordml" xmlns:w="http://schemas.openxmlformats.org/wordprocessingml/2006/main" xmlns:wne="http://schemas.microsoft.com/office/word/2006/wordml" xmlns:wp14="http://schemas.microsoft.com/office/word/2010/wordprocessingDrawing" xmlns:wp="http://schemas.openxmlformats.org/drawingml/2006/wordprocessingDrawing" xmlns:wpc="http://schemas.microsoft.com/office/word/2010/wordprocessingCanvas" xmlns:wpg="http://schemas.microsoft.com/office/word/2010/wordprocessingGroup" xmlns:wpi="http://schemas.microsoft.com/office/word/2010/wordprocessingInk" xmlns:wps="http://schemas.microsoft.com/office/word/2010/wordprocessingShape" mc:Ignorable="w14 wp14">
   <w:p>
     <w:pPr>
-      <w:pStyle w:val="Cabealho"/>
-    </w:pPr>
+      <w:pStyle w:val="Header"/>
+      <w:jc w:val="right"/>
+    </w:pPr>
+    <w:r>
+      <w:drawing>
+        <wp:inline xmlns:a="http://schemas.openxmlformats.org/drawingml/2006/main" xmlns:pic="http://schemas.openxmlformats.org/drawingml/2006/picture">
+          <wp:extent cx="841248" cy="575990"/>
+          <wp:docPr id="1" name="Picture 1"/>
+          <wp:cNvGraphicFramePr>
+            <a:graphicFrameLocks noChangeAspect="1"/>
+          </wp:cNvGraphicFramePr>
+          <a:graphic>
+            <a:graphicData uri="http://schemas.openxmlformats.org/drawingml/2006/picture">
+              <pic:pic>
+                <pic:nvPicPr>
+                  <pic:cNvPr id="0" name="logo_tristao.png"/>
+                  <pic:cNvPicPr/>
+                </pic:nvPicPr>
+                <pic:blipFill>
+                  <a:blip r:embed="rId1"/>
+                  <a:stretch>
+                    <a:fillRect/>
+                  </a:stretch>
+                </pic:blipFill>
+                <pic:spPr>
+                  <a:xfrm>
+                    <a:off x="0" y="0"/>
+                    <a:ext cx="841248" cy="575990"/>
+                  </a:xfrm>
+                  <a:prstGeom prst="rect"/>
+                </pic:spPr>
+              </pic:pic>
+            </a:graphicData>
+          </a:graphic>
+        </wp:inline>
+      </w:drawing>
+    </w:r>
+  </w:p>
+  <w:p>
+    <w:pPr>
+      <w:jc w:val="right"/>
+      <w:pBdr>
+        <w:bottom w:val="single" w:sz="6" w:space="8" w:color="BFC0BF"/>
+      </w:pBdr>
+    </w:pPr>
+    <w:r>
+      <w:rPr>
+        <w:rFonts w:ascii="Calibri" w:hAnsi="Calibri"/>
+        <w:b/>
+        <w:color w:val="D8232A"/>
+        <w:sz w:val="24"/>
+        <w:spacing w:val="50"/>
+      </w:rPr>
+      <w:t>TRISTÃO</w:t>
+    </w:r>
+    <w:r>
+      <w:rPr>
+        <w:rFonts w:ascii="Calibri" w:hAnsi="Calibri"/>
+        <w:b/>
+        <w:color w:val="8A8B8A"/>
+        <w:sz w:val="24"/>
+        <w:spacing w:val="50"/>
+      </w:rPr>
+      <w:t xml:space="preserve">  ADVOCACIA</w:t>
+    </w:r>
   </w:p>
 </w:hdr>
 </file>

</xml_diff>